<commit_message>
Added prose pagination for mobile
</commit_message>
<xml_diff>
--- a/manuscripts/Unicode/কয়েকটি ভেড়া ও একটি মানুষ (Unicode).docx
+++ b/manuscripts/Unicode/কয়েকটি ভেড়া ও একটি মানুষ (Unicode).docx
@@ -684,7 +684,21 @@
           <w:sz w:val="22"/>
         </w:rPr>
         <w:lastRenderedPageBreak/>
-        <w:t>ঢাকা শহরে এরকম একটা আলোকিত কিন্তু নির্জন গলি থাকতে পারে রুহির জানা ছিল না। রাস্তাটি দুইটা 90 ডিগ্রি স্úó মোড় নিয়ে খানিকটা আঁকাবাঁকা হয়ে ডিআইটি রোডে মিশেছে। রুহিদের বাসার সমানে দিয়ে গলির রাস্তাটা অবশ্য সোজাসুজি। পিলারের সঙ্গে লাগানো সবগুলো বাতি ঠিকঠাক জ্বলছে। অবশ্য স্বস্তির কথা এই, মাঝখানের একটি পিলারের আলো নেই, বাতি নষ্ট। সেখানটায় অন্ধকার; বেশ অন্ধকার। কাব্যিক ভাষায় বললে, একখণ্ড অন্ধকার জমে আছে যেন রাস্তার ধারে। চোখের ভ্রম কিনা, সেই অন্ধকারে দু’একটি জোনাক পোকার টিপটিপ আলোও আছে!</w:t>
+        <w:t xml:space="preserve">ঢাকা শহরে এরকম একটা আলোকিত কিন্তু নির্জন গলি থাকতে পারে রুহির জানা ছিল না। রাস্তাটি দুইটা 90 ডিগ্রি </w:t>
+      </w:r>
+      <w:r>
+        <w:rPr>
+          <w:rFonts w:ascii="Nirmala UI" w:hAnsi="Nirmala UI"/>
+          <w:sz w:val="22"/>
+        </w:rPr>
+        <w:t>স্পষ্ট</w:t>
+      </w:r>
+      <w:r>
+        <w:rPr>
+          <w:rFonts w:ascii="Nirmala UI" w:hAnsi="Nirmala UI"/>
+          <w:sz w:val="22"/>
+        </w:rPr>
+        <w:t xml:space="preserve"> মোড় নিয়ে খানিকটা আঁকাবাঁকা হয়ে ডিআইটি রোডে মিশেছে। রুহিদের বাসার সমানে দিয়ে গলির রাস্তাটা অবশ্য সোজাসুজি। পিলারের সঙ্গে লাগানো সবগুলো বাতি ঠিকঠাক জ্বলছে। অবশ্য স্বস্তির কথা এই, মাঝখানের একটি পিলারের আলো নেই, বাতি নষ্ট। সেখানটায় অন্ধকার; বেশ অন্ধকার। কাব্যিক ভাষায় বললে, একখণ্ড অন্ধকার জমে আছে যেন রাস্তার ধারে। চোখের ভ্রম কিনা, সেই অন্ধকারে দু’একটি জোনাক পোকার টিপটিপ আলোও আছে!</w:t>
       </w:r>
     </w:p>
     <w:p>
@@ -14395,16 +14409,7 @@
           <w:sz w:val="22"/>
         </w:rPr>
         <w:lastRenderedPageBreak/>
-        <w:t>এই ফাঁকে একটু ধাতস্থ হয়ে নেয় পল। দলনেতাটিকে দাঁতব্রাশ করার অনুরোধ করে দুর্গন্ধহীন চুমু খাওয়ার বাসনা জানায়। পলের কথায় দলটি স্মরণকালের বিস্ময়ে ঢুকে পড়ে। সকলের হা-করা মুখ থেকে দুর্গন্ধ ছড়িয়ে পড়ে সমস্ত রূমে। দম বন্ধ হয়ে আসে পলের। দলটির মধ্যে দুলে উঠলো ঘৃণার সাম্পা</w:t>
-      </w:r>
-      <w:bookmarkStart w:id="0" w:name="_GoBack"/>
-      <w:bookmarkEnd w:id="0"/>
-      <w:r>
-        <w:rPr>
-          <w:rFonts w:ascii="Nirmala UI" w:hAnsi="Nirmala UI"/>
-          <w:sz w:val="22"/>
-        </w:rPr>
-        <w:t>ন। পাথরিক স্তব্ধতা শেষে দলনেতাটি বলল, ‘লাত্থি মেরে বের করে দে এই কুত্তার বাচ্চারে।’ কয়েকজন পলকে চড় ত্থাপ্পড় ও লাথি মেরে গলি থেকে বের করে দেয়। পল দুঃখিত মনে ঘরে ফিরে আসে;</w:t>
+        <w:t>এই ফাঁকে একটু ধাতস্থ হয়ে নেয় পল। দলনেতাটিকে দাঁতব্রাশ করার অনুরোধ করে দুর্গন্ধহীন চুমু খাওয়ার বাসনা জানায়। পলের কথায় দলটি স্মরণকালের বিস্ময়ে ঢুকে পড়ে। সকলের হা-করা মুখ থেকে দুর্গন্ধ ছড়িয়ে পড়ে সমস্ত রূমে। দম বন্ধ হয়ে আসে পলের। দলটির মধ্যে দুলে উঠলো ঘৃণার সাম্পান। পাথরিক স্তব্ধতা শেষে দলনেতাটি বলল, ‘লাত্থি মেরে বের করে দে এই কুত্তার বাচ্চারে।’ কয়েকজন পলকে চড় ত্থাপ্পড় ও লাথি মেরে গলি থেকে বের করে দেয়। পল দুঃখিত মনে ঘরে ফিরে আসে;</w:t>
       </w:r>
     </w:p>
     <w:p>
@@ -18400,7 +18405,21 @@
           <w:rFonts w:ascii="Nirmala UI" w:hAnsi="Nirmala UI" w:cs="Nirmala UI"/>
           <w:sz w:val="20"/>
         </w:rPr>
-        <w:t>ভেতরঢুকে</w:t>
+        <w:t>ভেতর</w:t>
+      </w:r>
+      <w:r>
+        <w:rPr>
+          <w:rFonts w:ascii="Nirmala UI" w:hAnsi="Nirmala UI" w:cs="Nirmala UI"/>
+          <w:sz w:val="20"/>
+        </w:rPr>
+        <w:t xml:space="preserve"> </w:t>
+      </w:r>
+      <w:r>
+        <w:rPr>
+          <w:rFonts w:ascii="Nirmala UI" w:hAnsi="Nirmala UI" w:cs="Nirmala UI"/>
+          <w:sz w:val="20"/>
+        </w:rPr>
+        <w:t>ঢুকে</w:t>
       </w:r>
       <w:r>
         <w:rPr>
@@ -18446,13 +18465,20 @@
           <w:rFonts w:ascii="Nirmala UI" w:hAnsi="Nirmala UI" w:cs="Nirmala UI"/>
           <w:sz w:val="20"/>
         </w:rPr>
-        <w:t>এখনোস্</w:t>
-      </w:r>
-      <w:r>
-        <w:rPr>
-          <w:sz w:val="20"/>
-        </w:rPr>
-        <w:t xml:space="preserve">úó </w:t>
+        <w:t>এখনো</w:t>
+      </w:r>
+      <w:r>
+        <w:rPr>
+          <w:rFonts w:ascii="Nirmala UI" w:hAnsi="Nirmala UI" w:cs="Nirmala UI"/>
+          <w:sz w:val="20"/>
+        </w:rPr>
+        <w:t xml:space="preserve"> স্পষ্ট</w:t>
+      </w:r>
+      <w:r>
+        <w:rPr>
+          <w:sz w:val="20"/>
+        </w:rPr>
+        <w:t xml:space="preserve"> </w:t>
       </w:r>
       <w:r>
         <w:rPr>
@@ -18505,7 +18531,21 @@
           <w:rFonts w:ascii="Nirmala UI" w:hAnsi="Nirmala UI" w:cs="Nirmala UI"/>
           <w:sz w:val="20"/>
         </w:rPr>
-        <w:t>সন্ধ্যানেমেছে</w:t>
+        <w:t>সন্ধ্যা</w:t>
+      </w:r>
+      <w:r>
+        <w:rPr>
+          <w:rFonts w:ascii="Nirmala UI" w:hAnsi="Nirmala UI" w:cs="Nirmala UI"/>
+          <w:sz w:val="20"/>
+        </w:rPr>
+        <w:t xml:space="preserve"> </w:t>
+      </w:r>
+      <w:r>
+        <w:rPr>
+          <w:rFonts w:ascii="Nirmala UI" w:hAnsi="Nirmala UI" w:cs="Nirmala UI"/>
+          <w:sz w:val="20"/>
+        </w:rPr>
+        <w:t>নেমেছে</w:t>
       </w:r>
       <w:r>
         <w:rPr>
@@ -18577,7 +18617,21 @@
           <w:rFonts w:ascii="Nirmala UI" w:hAnsi="Nirmala UI" w:cs="Nirmala UI"/>
           <w:sz w:val="20"/>
         </w:rPr>
-        <w:t>সঙ্গেনতুন</w:t>
+        <w:t>সঙ্গে</w:t>
+      </w:r>
+      <w:r>
+        <w:rPr>
+          <w:rFonts w:ascii="Nirmala UI" w:hAnsi="Nirmala UI" w:cs="Nirmala UI"/>
+          <w:sz w:val="20"/>
+        </w:rPr>
+        <w:t xml:space="preserve"> </w:t>
+      </w:r>
+      <w:r>
+        <w:rPr>
+          <w:rFonts w:ascii="Nirmala UI" w:hAnsi="Nirmala UI" w:cs="Nirmala UI"/>
+          <w:sz w:val="20"/>
+        </w:rPr>
+        <w:t>নতুন</w:t>
       </w:r>
       <w:r>
         <w:rPr>
@@ -19003,7 +19057,21 @@
           <w:sz w:val="20"/>
         </w:rPr>
         <w:lastRenderedPageBreak/>
-        <w:t>মিশ্রণঠিক</w:t>
+        <w:t>মিশ্রণ</w:t>
+      </w:r>
+      <w:r>
+        <w:rPr>
+          <w:rFonts w:ascii="Nirmala UI" w:hAnsi="Nirmala UI" w:cs="Nirmala UI"/>
+          <w:sz w:val="20"/>
+        </w:rPr>
+        <w:t xml:space="preserve"> </w:t>
+      </w:r>
+      <w:r>
+        <w:rPr>
+          <w:rFonts w:ascii="Nirmala UI" w:hAnsi="Nirmala UI" w:cs="Nirmala UI"/>
+          <w:sz w:val="20"/>
+        </w:rPr>
+        <w:t>ঠিক</w:t>
       </w:r>
       <w:r>
         <w:rPr>
@@ -19075,7 +19143,21 @@
           <w:rFonts w:ascii="Nirmala UI" w:hAnsi="Nirmala UI" w:cs="Nirmala UI"/>
           <w:sz w:val="20"/>
         </w:rPr>
-        <w:t>নিজেইকালোর</w:t>
+        <w:t>নিজেই</w:t>
+      </w:r>
+      <w:r>
+        <w:rPr>
+          <w:rFonts w:ascii="Nirmala UI" w:hAnsi="Nirmala UI" w:cs="Nirmala UI"/>
+          <w:sz w:val="20"/>
+        </w:rPr>
+        <w:t xml:space="preserve"> </w:t>
+      </w:r>
+      <w:r>
+        <w:rPr>
+          <w:rFonts w:ascii="Nirmala UI" w:hAnsi="Nirmala UI" w:cs="Nirmala UI"/>
+          <w:sz w:val="20"/>
+        </w:rPr>
+        <w:t>কালোর</w:t>
       </w:r>
       <w:r>
         <w:rPr>
@@ -19127,7 +19209,21 @@
           <w:rFonts w:ascii="Nirmala UI" w:hAnsi="Nirmala UI" w:cs="Nirmala UI"/>
           <w:sz w:val="20"/>
         </w:rPr>
-        <w:t>সাদামিশিয়ে</w:t>
+        <w:t>সাদা</w:t>
+      </w:r>
+      <w:r>
+        <w:rPr>
+          <w:rFonts w:ascii="Nirmala UI" w:hAnsi="Nirmala UI" w:cs="Nirmala UI"/>
+          <w:sz w:val="20"/>
+        </w:rPr>
+        <w:t xml:space="preserve"> </w:t>
+      </w:r>
+      <w:r>
+        <w:rPr>
+          <w:rFonts w:ascii="Nirmala UI" w:hAnsi="Nirmala UI" w:cs="Nirmala UI"/>
+          <w:sz w:val="20"/>
+        </w:rPr>
+        <w:t>মিশিয়ে</w:t>
       </w:r>
       <w:r>
         <w:rPr>
@@ -19348,7 +19444,21 @@
           <w:rFonts w:ascii="Nirmala UI" w:hAnsi="Nirmala UI" w:cs="Nirmala UI"/>
           <w:sz w:val="20"/>
         </w:rPr>
-        <w:t>পাশেপায়চারিরত</w:t>
+        <w:t>পাশে</w:t>
+      </w:r>
+      <w:r>
+        <w:rPr>
+          <w:rFonts w:ascii="Nirmala UI" w:hAnsi="Nirmala UI" w:cs="Nirmala UI"/>
+          <w:sz w:val="20"/>
+        </w:rPr>
+        <w:t xml:space="preserve"> </w:t>
+      </w:r>
+      <w:r>
+        <w:rPr>
+          <w:rFonts w:ascii="Nirmala UI" w:hAnsi="Nirmala UI" w:cs="Nirmala UI"/>
+          <w:sz w:val="20"/>
+        </w:rPr>
+        <w:t>পায়চারিরত</w:t>
       </w:r>
       <w:r>
         <w:rPr>
@@ -19387,7 +19497,21 @@
           <w:rFonts w:ascii="Nirmala UI" w:hAnsi="Nirmala UI" w:cs="Nirmala UI"/>
           <w:sz w:val="20"/>
         </w:rPr>
-        <w:t>বলেমনে</w:t>
+        <w:t>বলে</w:t>
+      </w:r>
+      <w:r>
+        <w:rPr>
+          <w:rFonts w:ascii="Nirmala UI" w:hAnsi="Nirmala UI" w:cs="Nirmala UI"/>
+          <w:sz w:val="20"/>
+        </w:rPr>
+        <w:t xml:space="preserve"> </w:t>
+      </w:r>
+      <w:r>
+        <w:rPr>
+          <w:rFonts w:ascii="Nirmala UI" w:hAnsi="Nirmala UI" w:cs="Nirmala UI"/>
+          <w:sz w:val="20"/>
+        </w:rPr>
+        <w:t>মনে</w:t>
       </w:r>
       <w:r>
         <w:rPr>
@@ -19446,7 +19570,21 @@
           <w:rFonts w:ascii="Nirmala UI" w:hAnsi="Nirmala UI" w:cs="Nirmala UI"/>
           <w:sz w:val="20"/>
         </w:rPr>
-        <w:t>ওঅভয়ের</w:t>
+        <w:t>ও</w:t>
+      </w:r>
+      <w:r>
+        <w:rPr>
+          <w:rFonts w:ascii="Nirmala UI" w:hAnsi="Nirmala UI" w:cs="Nirmala UI"/>
+          <w:sz w:val="20"/>
+        </w:rPr>
+        <w:t xml:space="preserve"> </w:t>
+      </w:r>
+      <w:r>
+        <w:rPr>
+          <w:rFonts w:ascii="Nirmala UI" w:hAnsi="Nirmala UI" w:cs="Nirmala UI"/>
+          <w:sz w:val="20"/>
+        </w:rPr>
+        <w:t>অভয়ের</w:t>
       </w:r>
       <w:r>
         <w:rPr>
@@ -19485,7 +19623,21 @@
           <w:rFonts w:ascii="Nirmala UI" w:hAnsi="Nirmala UI" w:cs="Nirmala UI"/>
           <w:sz w:val="20"/>
         </w:rPr>
-        <w:t>দিকেতাকাচ্ছে</w:t>
+        <w:t>দিকে</w:t>
+      </w:r>
+      <w:r>
+        <w:rPr>
+          <w:rFonts w:ascii="Nirmala UI" w:hAnsi="Nirmala UI" w:cs="Nirmala UI"/>
+          <w:sz w:val="20"/>
+        </w:rPr>
+        <w:t xml:space="preserve"> </w:t>
+      </w:r>
+      <w:r>
+        <w:rPr>
+          <w:rFonts w:ascii="Nirmala UI" w:hAnsi="Nirmala UI" w:cs="Nirmala UI"/>
+          <w:sz w:val="20"/>
+        </w:rPr>
+        <w:t>তাকাচ্ছে</w:t>
       </w:r>
       <w:r>
         <w:rPr>
@@ -19602,7 +19754,21 @@
           <w:rFonts w:ascii="Nirmala UI" w:hAnsi="Nirmala UI" w:cs="Nirmala UI"/>
           <w:sz w:val="20"/>
         </w:rPr>
-        <w:t>আলোজ্বলছে</w:t>
+        <w:t>আলো</w:t>
+      </w:r>
+      <w:r>
+        <w:rPr>
+          <w:rFonts w:ascii="Nirmala UI" w:hAnsi="Nirmala UI" w:cs="Nirmala UI"/>
+          <w:sz w:val="20"/>
+        </w:rPr>
+        <w:t xml:space="preserve"> </w:t>
+      </w:r>
+      <w:r>
+        <w:rPr>
+          <w:rFonts w:ascii="Nirmala UI" w:hAnsi="Nirmala UI" w:cs="Nirmala UI"/>
+          <w:sz w:val="20"/>
+        </w:rPr>
+        <w:t>জ্বলছে</w:t>
       </w:r>
       <w:r>
         <w:rPr>
@@ -19664,6 +19830,12 @@
       </w:r>
       <w:r>
         <w:rPr>
+          <w:sz w:val="20"/>
+        </w:rPr>
+        <w:t xml:space="preserve"> </w:t>
+      </w:r>
+      <w:r>
+        <w:rPr>
           <w:rFonts w:ascii="Nirmala UI" w:hAnsi="Nirmala UI" w:cs="Nirmala UI"/>
           <w:sz w:val="20"/>
         </w:rPr>
@@ -19706,7 +19878,21 @@
           <w:rFonts w:ascii="Nirmala UI" w:hAnsi="Nirmala UI" w:cs="Nirmala UI"/>
           <w:sz w:val="20"/>
         </w:rPr>
-        <w:t>টাঙানোসুজিতের</w:t>
+        <w:t>টাঙানো</w:t>
+      </w:r>
+      <w:r>
+        <w:rPr>
+          <w:rFonts w:ascii="Nirmala UI" w:hAnsi="Nirmala UI" w:cs="Nirmala UI"/>
+          <w:sz w:val="20"/>
+        </w:rPr>
+        <w:t xml:space="preserve"> </w:t>
+      </w:r>
+      <w:r>
+        <w:rPr>
+          <w:rFonts w:ascii="Nirmala UI" w:hAnsi="Nirmala UI" w:cs="Nirmala UI"/>
+          <w:sz w:val="20"/>
+        </w:rPr>
+        <w:t>সুজিতের</w:t>
       </w:r>
       <w:r>
         <w:rPr>
@@ -19742,6 +19928,12 @@
       </w:r>
       <w:r>
         <w:rPr>
+          <w:sz w:val="20"/>
+        </w:rPr>
+        <w:t xml:space="preserve"> </w:t>
+      </w:r>
+      <w:r>
+        <w:rPr>
           <w:rFonts w:ascii="Nirmala UI" w:hAnsi="Nirmala UI" w:cs="Nirmala UI"/>
           <w:sz w:val="20"/>
         </w:rPr>
@@ -19771,7 +19963,21 @@
           <w:rFonts w:ascii="Nirmala UI" w:hAnsi="Nirmala UI" w:cs="Nirmala UI"/>
           <w:sz w:val="20"/>
         </w:rPr>
-        <w:t>থেকেভেসে</w:t>
+        <w:t>থেকে</w:t>
+      </w:r>
+      <w:r>
+        <w:rPr>
+          <w:rFonts w:ascii="Nirmala UI" w:hAnsi="Nirmala UI" w:cs="Nirmala UI"/>
+          <w:sz w:val="20"/>
+        </w:rPr>
+        <w:t xml:space="preserve"> </w:t>
+      </w:r>
+      <w:r>
+        <w:rPr>
+          <w:rFonts w:ascii="Nirmala UI" w:hAnsi="Nirmala UI" w:cs="Nirmala UI"/>
+          <w:sz w:val="20"/>
+        </w:rPr>
+        <w:t>ভেসে</w:t>
       </w:r>
       <w:r>
         <w:rPr>
@@ -19830,7 +20036,21 @@
           <w:rFonts w:ascii="Nirmala UI" w:hAnsi="Nirmala UI" w:cs="Nirmala UI"/>
           <w:sz w:val="20"/>
         </w:rPr>
-        <w:t>সাইকেলেরপাশ</w:t>
+        <w:t>সাইকেলের</w:t>
+      </w:r>
+      <w:r>
+        <w:rPr>
+          <w:rFonts w:ascii="Nirmala UI" w:hAnsi="Nirmala UI" w:cs="Nirmala UI"/>
+          <w:sz w:val="20"/>
+        </w:rPr>
+        <w:t xml:space="preserve"> </w:t>
+      </w:r>
+      <w:r>
+        <w:rPr>
+          <w:rFonts w:ascii="Nirmala UI" w:hAnsi="Nirmala UI" w:cs="Nirmala UI"/>
+          <w:sz w:val="20"/>
+        </w:rPr>
+        <w:t>পাশ</w:t>
       </w:r>
       <w:r>
         <w:rPr>
@@ -19882,7 +20102,21 @@
           <w:rFonts w:ascii="Nirmala UI" w:hAnsi="Nirmala UI" w:cs="Nirmala UI"/>
           <w:sz w:val="20"/>
         </w:rPr>
-        <w:t>আমারদিকে</w:t>
+        <w:t>আমার</w:t>
+      </w:r>
+      <w:r>
+        <w:rPr>
+          <w:rFonts w:ascii="Nirmala UI" w:hAnsi="Nirmala UI" w:cs="Nirmala UI"/>
+          <w:sz w:val="20"/>
+        </w:rPr>
+        <w:t xml:space="preserve"> </w:t>
+      </w:r>
+      <w:r>
+        <w:rPr>
+          <w:rFonts w:ascii="Nirmala UI" w:hAnsi="Nirmala UI" w:cs="Nirmala UI"/>
+          <w:sz w:val="20"/>
+        </w:rPr>
+        <w:t>দিকে</w:t>
       </w:r>
       <w:r>
         <w:rPr>
@@ -19914,7 +20148,21 @@
           <w:rFonts w:ascii="Nirmala UI" w:hAnsi="Nirmala UI" w:cs="Nirmala UI"/>
           <w:sz w:val="20"/>
         </w:rPr>
-        <w:t>ততোবারইবারান্দার</w:t>
+        <w:t>ততোবারই</w:t>
+      </w:r>
+      <w:r>
+        <w:rPr>
+          <w:rFonts w:ascii="Nirmala UI" w:hAnsi="Nirmala UI" w:cs="Nirmala UI"/>
+          <w:sz w:val="20"/>
+        </w:rPr>
+        <w:t xml:space="preserve"> </w:t>
+      </w:r>
+      <w:r>
+        <w:rPr>
+          <w:rFonts w:ascii="Nirmala UI" w:hAnsi="Nirmala UI" w:cs="Nirmala UI"/>
+          <w:sz w:val="20"/>
+        </w:rPr>
+        <w:t>বারান্দার</w:t>
       </w:r>
       <w:r>
         <w:rPr>
@@ -19953,7 +20201,21 @@
           <w:rFonts w:ascii="Nirmala UI" w:hAnsi="Nirmala UI" w:cs="Nirmala UI"/>
           <w:sz w:val="20"/>
         </w:rPr>
-        <w:t>যাচ্ছেজলকলমি</w:t>
+        <w:t>যাচ্ছে</w:t>
+      </w:r>
+      <w:r>
+        <w:rPr>
+          <w:rFonts w:ascii="Nirmala UI" w:hAnsi="Nirmala UI" w:cs="Nirmala UI"/>
+          <w:sz w:val="20"/>
+        </w:rPr>
+        <w:t xml:space="preserve"> </w:t>
+      </w:r>
+      <w:r>
+        <w:rPr>
+          <w:rFonts w:ascii="Nirmala UI" w:hAnsi="Nirmala UI" w:cs="Nirmala UI"/>
+          <w:sz w:val="20"/>
+        </w:rPr>
+        <w:t>জলকলমি</w:t>
       </w:r>
       <w:r>
         <w:rPr>
@@ -20012,7 +20274,21 @@
           <w:rFonts w:ascii="Nirmala UI" w:hAnsi="Nirmala UI" w:cs="Nirmala UI"/>
           <w:sz w:val="20"/>
         </w:rPr>
-        <w:t>আলোয়গলিত</w:t>
+        <w:t>আলোয়</w:t>
+      </w:r>
+      <w:r>
+        <w:rPr>
+          <w:rFonts w:ascii="Nirmala UI" w:hAnsi="Nirmala UI" w:cs="Nirmala UI"/>
+          <w:sz w:val="20"/>
+        </w:rPr>
+        <w:t xml:space="preserve"> </w:t>
+      </w:r>
+      <w:r>
+        <w:rPr>
+          <w:rFonts w:ascii="Nirmala UI" w:hAnsi="Nirmala UI" w:cs="Nirmala UI"/>
+          <w:sz w:val="20"/>
+        </w:rPr>
+        <w:t>গলিত</w:t>
       </w:r>
       <w:r>
         <w:rPr>
@@ -20064,7 +20340,21 @@
           <w:rFonts w:ascii="Nirmala UI" w:hAnsi="Nirmala UI" w:cs="Nirmala UI"/>
           <w:sz w:val="20"/>
         </w:rPr>
-        <w:t>হয়েউঠছে</w:t>
+        <w:t>হয়ে</w:t>
+      </w:r>
+      <w:r>
+        <w:rPr>
+          <w:rFonts w:ascii="Nirmala UI" w:hAnsi="Nirmala UI" w:cs="Nirmala UI"/>
+          <w:sz w:val="20"/>
+        </w:rPr>
+        <w:t xml:space="preserve"> </w:t>
+      </w:r>
+      <w:r>
+        <w:rPr>
+          <w:rFonts w:ascii="Nirmala UI" w:hAnsi="Nirmala UI" w:cs="Nirmala UI"/>
+          <w:sz w:val="20"/>
+        </w:rPr>
+        <w:t>উঠছে</w:t>
       </w:r>
       <w:r>
         <w:rPr>
@@ -20130,7 +20420,21 @@
           <w:sz w:val="20"/>
         </w:rPr>
         <w:lastRenderedPageBreak/>
-        <w:t>আরবিড়ালটিকে</w:t>
+        <w:t>আর</w:t>
+      </w:r>
+      <w:r>
+        <w:rPr>
+          <w:rFonts w:ascii="Nirmala UI" w:hAnsi="Nirmala UI" w:cs="Nirmala UI"/>
+          <w:sz w:val="20"/>
+        </w:rPr>
+        <w:t xml:space="preserve"> </w:t>
+      </w:r>
+      <w:r>
+        <w:rPr>
+          <w:rFonts w:ascii="Nirmala UI" w:hAnsi="Nirmala UI" w:cs="Nirmala UI"/>
+          <w:sz w:val="20"/>
+        </w:rPr>
+        <w:t>বিড়ালটিকে</w:t>
       </w:r>
       <w:r>
         <w:rPr>
@@ -20241,7 +20545,21 @@
           <w:rFonts w:ascii="Nirmala UI" w:hAnsi="Nirmala UI" w:cs="Nirmala UI"/>
           <w:sz w:val="20"/>
         </w:rPr>
-        <w:t>কাঁধেদুইটি</w:t>
+        <w:t>কাঁধে</w:t>
+      </w:r>
+      <w:r>
+        <w:rPr>
+          <w:rFonts w:ascii="Nirmala UI" w:hAnsi="Nirmala UI" w:cs="Nirmala UI"/>
+          <w:sz w:val="20"/>
+        </w:rPr>
+        <w:t xml:space="preserve"> </w:t>
+      </w:r>
+      <w:r>
+        <w:rPr>
+          <w:rFonts w:ascii="Nirmala UI" w:hAnsi="Nirmala UI" w:cs="Nirmala UI"/>
+          <w:sz w:val="20"/>
+        </w:rPr>
+        <w:t>দুইটি</w:t>
       </w:r>
       <w:r>
         <w:rPr>
@@ -20304,6 +20622,13 @@
       </w:r>
       <w:r>
         <w:rPr>
+          <w:rFonts w:ascii="Mangal" w:hAnsi="Mangal" w:cs="Mangal"/>
+          <w:sz w:val="20"/>
+        </w:rPr>
+        <w:t xml:space="preserve"> </w:t>
+      </w:r>
+      <w:r>
+        <w:rPr>
           <w:rFonts w:ascii="Nirmala UI" w:hAnsi="Nirmala UI" w:cs="Nirmala UI"/>
           <w:sz w:val="20"/>
         </w:rPr>
@@ -20366,7 +20691,21 @@
           <w:sz w:val="20"/>
         </w:rPr>
         <w:lastRenderedPageBreak/>
-        <w:t>চাঁদহঠাৎ</w:t>
+        <w:t>চাঁদ</w:t>
+      </w:r>
+      <w:r>
+        <w:rPr>
+          <w:rFonts w:ascii="Nirmala UI" w:hAnsi="Nirmala UI" w:cs="Nirmala UI"/>
+          <w:sz w:val="20"/>
+        </w:rPr>
+        <w:t xml:space="preserve"> </w:t>
+      </w:r>
+      <w:r>
+        <w:rPr>
+          <w:rFonts w:ascii="Nirmala UI" w:hAnsi="Nirmala UI" w:cs="Nirmala UI"/>
+          <w:sz w:val="20"/>
+        </w:rPr>
+        <w:t>হঠাৎ</w:t>
       </w:r>
       <w:r>
         <w:rPr>
@@ -20497,7 +20836,21 @@
           <w:rFonts w:ascii="Nirmala UI" w:hAnsi="Nirmala UI" w:cs="Nirmala UI"/>
           <w:sz w:val="20"/>
         </w:rPr>
-        <w:t>ষড়যন্ত্রশেষ</w:t>
+        <w:t>ষড়যন্ত্র</w:t>
+      </w:r>
+      <w:r>
+        <w:rPr>
+          <w:rFonts w:ascii="Nirmala UI" w:hAnsi="Nirmala UI" w:cs="Nirmala UI"/>
+          <w:sz w:val="20"/>
+        </w:rPr>
+        <w:t xml:space="preserve"> </w:t>
+      </w:r>
+      <w:r>
+        <w:rPr>
+          <w:rFonts w:ascii="Nirmala UI" w:hAnsi="Nirmala UI" w:cs="Nirmala UI"/>
+          <w:sz w:val="20"/>
+        </w:rPr>
+        <w:t>শেষ</w:t>
       </w:r>
       <w:r>
         <w:rPr>
@@ -20562,7 +20915,21 @@
           <w:rFonts w:ascii="Nirmala UI" w:hAnsi="Nirmala UI" w:cs="Nirmala UI"/>
           <w:sz w:val="20"/>
         </w:rPr>
-        <w:t>পেলামনা</w:t>
+        <w:t>পেলাম</w:t>
+      </w:r>
+      <w:r>
+        <w:rPr>
+          <w:rFonts w:ascii="Nirmala UI" w:hAnsi="Nirmala UI" w:cs="Nirmala UI"/>
+          <w:sz w:val="20"/>
+        </w:rPr>
+        <w:t xml:space="preserve"> </w:t>
+      </w:r>
+      <w:r>
+        <w:rPr>
+          <w:rFonts w:ascii="Nirmala UI" w:hAnsi="Nirmala UI" w:cs="Nirmala UI"/>
+          <w:sz w:val="20"/>
+        </w:rPr>
+        <w:t>না</w:t>
       </w:r>
       <w:r>
         <w:rPr>
@@ -20621,7 +20988,21 @@
           <w:rFonts w:ascii="Nirmala UI" w:hAnsi="Nirmala UI" w:cs="Nirmala UI"/>
           <w:sz w:val="20"/>
         </w:rPr>
-        <w:t>কিম্বাছাই</w:t>
+        <w:t>কিম্বা</w:t>
+      </w:r>
+      <w:r>
+        <w:rPr>
+          <w:rFonts w:ascii="Nirmala UI" w:hAnsi="Nirmala UI" w:cs="Nirmala UI"/>
+          <w:sz w:val="20"/>
+        </w:rPr>
+        <w:t xml:space="preserve"> </w:t>
+      </w:r>
+      <w:r>
+        <w:rPr>
+          <w:rFonts w:ascii="Nirmala UI" w:hAnsi="Nirmala UI" w:cs="Nirmala UI"/>
+          <w:sz w:val="20"/>
+        </w:rPr>
+        <w:t>ছাই</w:t>
       </w:r>
       <w:r>
         <w:rPr>
@@ -20660,7 +21041,23 @@
           <w:rFonts w:ascii="Nirmala UI" w:hAnsi="Nirmala UI" w:cs="Nirmala UI"/>
           <w:sz w:val="20"/>
         </w:rPr>
-        <w:t>বিন্দুমাত্রচিহ্ন</w:t>
+        <w:t>বিন্দুমাত্র</w:t>
+      </w:r>
+      <w:r>
+        <w:rPr>
+          <w:rFonts w:ascii="Nirmala UI" w:hAnsi="Nirmala UI" w:cs="Nirmala UI"/>
+          <w:sz w:val="20"/>
+        </w:rPr>
+        <w:t xml:space="preserve"> </w:t>
+      </w:r>
+      <w:bookmarkStart w:id="0" w:name="_GoBack"/>
+      <w:bookmarkEnd w:id="0"/>
+      <w:r>
+        <w:rPr>
+          <w:rFonts w:ascii="Nirmala UI" w:hAnsi="Nirmala UI" w:cs="Nirmala UI"/>
+          <w:sz w:val="20"/>
+        </w:rPr>
+        <w:t>চিহ্ন</w:t>
       </w:r>
       <w:r>
         <w:rPr>
@@ -20973,6 +21370,12 @@
               <w:sz w:val="22"/>
             </w:rPr>
             <w:t>সুমন এর গান শোনা যাক—মানুষ জমেছে দাবি গরাদ ভাঙার, ভাঙে যেন জানালার গরাদ সবার ...</w:t>
+          </w:r>
+          <w:r>
+            <w:t>‬</w:t>
+          </w:r>
+          <w:r>
+            <w:t>‬</w:t>
           </w:r>
           <w:r>
             <w:t>‬</w:t>
@@ -28013,7 +28416,7 @@
 </file>
 
 <file path=customXml/itemProps1.xml><?xml version="1.0" encoding="utf-8"?>
-<ds:datastoreItem xmlns:ds="http://schemas.openxmlformats.org/officeDocument/2006/customXml" ds:itemID="{FF6D34E0-BEB3-40F6-9A63-F29FE54462B7}">
+<ds:datastoreItem xmlns:ds="http://schemas.openxmlformats.org/officeDocument/2006/customXml" ds:itemID="{BFDFAE08-85FA-4E87-A67B-3CF71D232927}">
   <ds:schemaRefs>
     <ds:schemaRef ds:uri="http://schemas.openxmlformats.org/officeDocument/2006/bibliography"/>
   </ds:schemaRefs>

</xml_diff>